<commit_message>
Actualiza la memoria con el despliegue provisional en InfinityFree
Añade URL y repositorio en la portada, la decisión de alojamiento, la
limitación del filtro anti-bots, los errores encontrados al desplegar y
las pruebas hechas en el hosting.

Co-Authored-By: Claude Opus 5.5 <noreply@anthropic.com>
</commit_message>
<xml_diff>
--- a/docs/Memoria_NOCTILUZ.docx
+++ b/docs/Memoria_NOCTILUZ.docx
@@ -146,16 +146,7 @@
         <w:jc w:val="center"/>
       </w:pPr>
       <w:r>
-        <w:t xml:space="preserve">URL pública: </w:t>
-      </w:r>
-      <w:r>
-        <w:rPr>
-          <w:b/>
-          <w:bCs/>
-          <w:highlight w:val="yellow"/>
-          <w:highlightCs w:val="yellow"/>
-        </w:rPr>
-        <w:t xml:space="preserve">[COMPLETAR: https://noctiluz.xxx]</w:t>
+        <w:t xml:space="preserve">URL pública: https://algo.free.je (despliegue provisional)</w:t>
       </w:r>
     </w:p>
     <w:p>
@@ -163,16 +154,7 @@
         <w:jc w:val="center"/>
       </w:pPr>
       <w:r>
-        <w:t xml:space="preserve">Repositorio: </w:t>
-      </w:r>
-      <w:r>
-        <w:rPr>
-          <w:b/>
-          <w:bCs/>
-          <w:highlight w:val="yellow"/>
-          <w:highlightCs w:val="yellow"/>
-        </w:rPr>
-        <w:t xml:space="preserve">[COMPLETAR: https://github.com/...]</w:t>
+        <w:t xml:space="preserve">Repositorio: https://github.com/luisgabu0-gif/noctiluz-ucam</w:t>
       </w:r>
     </w:p>
     <w:p>
@@ -278,7 +260,7 @@
         <w:jc w:val="both"/>
       </w:pPr>
       <w:r>
-        <w:t xml:space="preserve">Se ha optado por una arquitectura cliente-servidor en capas, desplegada en el alojamiento compartido de DonDominio (Apache, PHP y MySQL):</w:t>
+        <w:t xml:space="preserve">Se ha optado por una arquitectura cliente-servidor en capas, pensada para un alojamiento compartido con Apache, PHP y MySQL. Está desplegada de forma provisional en InfinityFree y preparada para trasladarse a DonDominio sin cambiar el código:</w:t>
       </w:r>
     </w:p>
     <w:p>
@@ -1520,6 +1502,146 @@
                 <w:szCs w:val="18"/>
               </w:rPr>
               <w:t xml:space="preserve">Guarda menos datos personales y simplifica el flujo; es suficiente para un prototipo.</w:t>
+            </w:r>
+          </w:p>
+        </w:tc>
+      </w:tr>
+      <w:tr>
+        <w:trPr>
+          <w:tblHeader w:val="false"/>
+        </w:trPr>
+        <w:tc>
+          <w:tcPr>
+            <w:tcW w:type="dxa" w:w="1500"/>
+            <w:tcBorders>
+              <w:top w:val="single" w:color="B8BCC6" w:sz="4"/>
+              <w:left w:val="single" w:color="B8BCC6" w:sz="4"/>
+              <w:bottom w:val="single" w:color="B8BCC6" w:sz="4"/>
+              <w:right w:val="single" w:color="B8BCC6" w:sz="4"/>
+            </w:tcBorders>
+            <w:shd w:fill="F3F5F8" w:color="auto" w:val="clear"/>
+            <w:tcMar>
+              <w:top w:type="dxa" w:w="50"/>
+              <w:left w:type="dxa" w:w="90"/>
+              <w:bottom w:type="dxa" w:w="50"/>
+              <w:right w:type="dxa" w:w="90"/>
+            </w:tcMar>
+          </w:tcPr>
+          <w:p>
+            <w:pPr>
+              <w:spacing w:after="20"/>
+            </w:pPr>
+            <w:r>
+              <w:rPr>
+                <w:sz w:val="18"/>
+                <w:szCs w:val="18"/>
+              </w:rPr>
+              <w:t xml:space="preserve">Alojamiento</w:t>
+            </w:r>
+          </w:p>
+        </w:tc>
+        <w:tc>
+          <w:tcPr>
+            <w:tcW w:type="dxa" w:w="2000"/>
+            <w:tcBorders>
+              <w:top w:val="single" w:color="B8BCC6" w:sz="4"/>
+              <w:left w:val="single" w:color="B8BCC6" w:sz="4"/>
+              <w:bottom w:val="single" w:color="B8BCC6" w:sz="4"/>
+              <w:right w:val="single" w:color="B8BCC6" w:sz="4"/>
+            </w:tcBorders>
+            <w:shd w:fill="F3F5F8" w:color="auto" w:val="clear"/>
+            <w:tcMar>
+              <w:top w:type="dxa" w:w="50"/>
+              <w:left w:type="dxa" w:w="90"/>
+              <w:bottom w:type="dxa" w:w="50"/>
+              <w:right w:type="dxa" w:w="90"/>
+            </w:tcMar>
+          </w:tcPr>
+          <w:p>
+            <w:pPr>
+              <w:spacing w:after="20"/>
+            </w:pPr>
+            <w:r>
+              <w:rPr>
+                <w:sz w:val="18"/>
+                <w:szCs w:val="18"/>
+              </w:rPr>
+              <w:t xml:space="preserve">InfinityFree (gratuito), provisional</w:t>
+            </w:r>
+          </w:p>
+        </w:tc>
+        <w:tc>
+          <w:tcPr>
+            <w:tcW w:type="dxa" w:w="2250"/>
+            <w:tcBorders>
+              <w:top w:val="single" w:color="B8BCC6" w:sz="4"/>
+              <w:left w:val="single" w:color="B8BCC6" w:sz="4"/>
+              <w:bottom w:val="single" w:color="B8BCC6" w:sz="4"/>
+              <w:right w:val="single" w:color="B8BCC6" w:sz="4"/>
+            </w:tcBorders>
+            <w:shd w:fill="F3F5F8" w:color="auto" w:val="clear"/>
+            <w:tcMar>
+              <w:top w:type="dxa" w:w="50"/>
+              <w:left w:type="dxa" w:w="90"/>
+              <w:bottom w:type="dxa" w:w="50"/>
+              <w:right w:type="dxa" w:w="90"/>
+            </w:tcMar>
+          </w:tcPr>
+          <w:p>
+            <w:pPr>
+              <w:spacing w:after="20"/>
+            </w:pPr>
+            <w:r>
+              <w:rPr>
+                <w:sz w:val="18"/>
+                <w:szCs w:val="18"/>
+              </w:rPr>
+              <w:t xml:space="preserve">DonDominio Alojamiento Básico; Vercel</w:t>
+            </w:r>
+          </w:p>
+        </w:tc>
+        <w:tc>
+          <w:tcPr>
+            <w:tcW w:type="dxa" w:w="3322"/>
+            <w:tcBorders>
+              <w:top w:val="single" w:color="B8BCC6" w:sz="4"/>
+              <w:left w:val="single" w:color="B8BCC6" w:sz="4"/>
+              <w:bottom w:val="single" w:color="B8BCC6" w:sz="4"/>
+              <w:right w:val="single" w:color="B8BCC6" w:sz="4"/>
+            </w:tcBorders>
+            <w:shd w:fill="F3F5F8" w:color="auto" w:val="clear"/>
+            <w:tcMar>
+              <w:top w:type="dxa" w:w="50"/>
+              <w:left w:type="dxa" w:w="90"/>
+              <w:bottom w:type="dxa" w:w="50"/>
+              <w:right w:type="dxa" w:w="90"/>
+            </w:tcMar>
+          </w:tcPr>
+          <w:p>
+            <w:pPr>
+              <w:spacing w:after="20"/>
+            </w:pPr>
+            <w:r>
+              <w:rPr>
+                <w:sz w:val="18"/>
+                <w:szCs w:val="18"/>
+              </w:rPr>
+              <w:t xml:space="preserve">Vercel no ejecuta PHP de forma nativa ni ofrece MySQL. InfinityFree ofrece lo mismo que DonDominio (Apache, PHP 8, MySQL, phpMyAdmin y </w:t>
+            </w:r>
+            <w:r>
+              <w:rPr>
+                <w:rFonts w:ascii="Consolas" w:cs="Consolas" w:eastAsia="Consolas" w:hAnsi="Consolas"/>
+                <w:sz w:val="19"/>
+                <w:szCs w:val="19"/>
+              </w:rPr>
+              <w:t xml:space="preserve">.htaccess</w:t>
+            </w:r>
+            <w:r>
+              <w:rPr>
+                <w:sz w:val="18"/>
+                <w:szCs w:val="18"/>
+              </w:rPr>
+              <w:t xml:space="preserve">) sin coste, así que migrar solo implica repetir la importación y la subida de archivos.</w:t>
             </w:r>
           </w:p>
         </w:tc>
@@ -3758,118 +3880,6 @@
     </w:p>
     <w:p>
       <w:pPr>
-        <w:spacing w:after="80"/>
-      </w:pPr>
-    </w:p>
-    <w:p>
-      <w:pPr>
-        <w:pStyle w:val="Heading1"/>
-      </w:pPr>
-      <w:r>
-        <w:t xml:space="preserve">5. Uso declarado de herramientas de IA generativa</w:t>
-      </w:r>
-    </w:p>
-    <w:p>
-      <w:pPr>
-        <w:spacing w:after="120" w:line="276"/>
-        <w:jc w:val="both"/>
-      </w:pPr>
-      <w:r>
-        <w:t xml:space="preserve">Se han utilizado herramientas de IA generativa en la versión inicial de la interfaz y, posteriormente, Claude Code (Anthropic) como asistente para el análisis del enunciado, el diseño de la arquitectura y del modelo de datos, la programación, la generación de datos de prueba, las pruebas y la redacción del borrador de esta memoria y del README. El grupo ha revisado, probado y modificado el resultado. El detalle exigido por el enunciado (herramientas, tareas, partes asistidas, errores detectados, cambios del grupo y validación) figura en el Anexo A.</w:t>
-      </w:r>
-    </w:p>
-    <w:p>
-      <w:pPr>
-        <w:pStyle w:val="Heading1"/>
-      </w:pPr>
-      <w:r>
-        <w:t xml:space="preserve">6. Declaración del punto de partida</w:t>
-      </w:r>
-    </w:p>
-    <w:p>
-      <w:pPr>
-        <w:spacing w:after="120" w:line="276"/>
-        <w:jc w:val="both"/>
-      </w:pPr>
-      <w:r>
-        <w:t xml:space="preserve">El proyecto </w:t>
-      </w:r>
-      <w:r>
-        <w:rPr>
-          <w:b/>
-          <w:bCs/>
-        </w:rPr>
-        <w:t xml:space="preserve">no parte de ningún repositorio ni plantilla de terceros</w:t>
-      </w:r>
-      <w:r>
-        <w:t xml:space="preserve">. Su punto de partida es una </w:t>
-      </w:r>
-      <w:r>
-        <w:rPr>
-          <w:b/>
-          <w:bCs/>
-        </w:rPr>
-        <w:t xml:space="preserve">versión inicial generada mediante IA</w:t>
-      </w:r>
-      <w:r>
-        <w:t xml:space="preserve">: un único archivo HTML (</w:t>
-      </w:r>
-      <w:r>
-        <w:rPr>
-          <w:rFonts w:ascii="Consolas" w:cs="Consolas" w:eastAsia="Consolas" w:hAnsi="Consolas"/>
-          <w:sz w:val="19"/>
-          <w:szCs w:val="19"/>
-        </w:rPr>
-        <w:t xml:space="preserve">docs/version_inicial/NOCTILUZ — Tienda.html</w:t>
-      </w:r>
-      <w:r>
-        <w:t xml:space="preserve">) con la portada, el catálogo, la ficha de producto y un carrito guardado en el navegador, sin servidor, sin persistencia y con el filtro de modo sin funcionar. </w:t>
-      </w:r>
-      <w:r>
-        <w:rPr>
-          <w:b/>
-          <w:bCs/>
-          <w:highlight w:val="yellow"/>
-          <w:highlightCs w:val="yellow"/>
-        </w:rPr>
-        <w:t xml:space="preserve">[COMPLETAR: herramienta de IA con la que se generó y quién la generó]</w:t>
-      </w:r>
-      <w:r>
-        <w:t xml:space="preserve">.</w:t>
-      </w:r>
-    </w:p>
-    <w:p>
-      <w:pPr>
-        <w:spacing w:after="120" w:line="276"/>
-        <w:jc w:val="both"/>
-      </w:pPr>
-      <w:r>
-        <w:t xml:space="preserve">A partir de esa versión se reutilizó el diseño visual y, con asistencia de Claude Code, se desarrolló el resto: servidor PHP, modelo de datos, checkout, pago simulado, pedidos y estados, soporte, back-office e instrumentación de eventos. El primer commit del repositorio contiene la versión inicial sin modificar, para que la evolución posterior sea trazable en el historial.</w:t>
-      </w:r>
-    </w:p>
-    <w:p>
-      <w:r>
-        <w:br w:type="page"/>
-      </w:r>
-    </w:p>
-    <w:p>
-      <w:pPr>
-        <w:pStyle w:val="Heading1"/>
-      </w:pPr>
-      <w:r>
-        <w:t xml:space="preserve">Anexo A. Uso de IA generativa</w:t>
-      </w:r>
-    </w:p>
-    <w:p>
-      <w:pPr>
-        <w:pStyle w:val="Heading2"/>
-      </w:pPr>
-      <w:r>
-        <w:t xml:space="preserve">a) Herramientas utilizadas</w:t>
-      </w:r>
-    </w:p>
-    <w:p>
-      <w:pPr>
         <w:pStyle w:val="ListParagraph"/>
         <w:numPr>
           <w:ilvl w:val="0"/>
@@ -3878,16 +3888,119 @@
         <w:spacing w:after="60" w:line="264"/>
       </w:pPr>
       <w:r>
+        <w:t xml:space="preserve">El alojamiento provisional (InfinityFree) usa un subdominio genérico y filtra con una comprobación en JavaScript las peticiones que no vienen de un navegador. Un programa externo, como el consumidor de eventos de la Tarea 2, no podría leer la API allí; en DonDominio no existe esa restricción.</w:t>
+      </w:r>
+    </w:p>
+    <w:p>
+      <w:pPr>
+        <w:spacing w:after="80"/>
+      </w:pPr>
+    </w:p>
+    <w:p>
+      <w:pPr>
+        <w:pStyle w:val="Heading1"/>
+      </w:pPr>
+      <w:r>
+        <w:t xml:space="preserve">5. Uso declarado de herramientas de IA generativa</w:t>
+      </w:r>
+    </w:p>
+    <w:p>
+      <w:pPr>
+        <w:spacing w:after="120" w:line="276"/>
+        <w:jc w:val="both"/>
+      </w:pPr>
+      <w:r>
+        <w:t xml:space="preserve">Se han utilizado herramientas de IA generativa en la versión inicial de la interfaz y, posteriormente, Claude Code (Anthropic) como asistente para el análisis del enunciado, el diseño de la arquitectura y del modelo de datos, la programación, la generación de datos de prueba, las pruebas y la redacción del borrador de esta memoria y del README. El grupo ha revisado, probado y modificado el resultado. El detalle exigido por el enunciado (herramientas, tareas, partes asistidas, errores detectados, cambios del grupo y validación) figura en el Anexo A.</w:t>
+      </w:r>
+    </w:p>
+    <w:p>
+      <w:pPr>
+        <w:pStyle w:val="Heading1"/>
+      </w:pPr>
+      <w:r>
+        <w:t xml:space="preserve">6. Declaración del punto de partida</w:t>
+      </w:r>
+    </w:p>
+    <w:p>
+      <w:pPr>
+        <w:spacing w:after="120" w:line="276"/>
+        <w:jc w:val="both"/>
+      </w:pPr>
+      <w:r>
+        <w:t xml:space="preserve">El proyecto </w:t>
+      </w:r>
+      <w:r>
+        <w:rPr>
+          <w:b/>
+          <w:bCs/>
+        </w:rPr>
+        <w:t xml:space="preserve">no parte de ningún repositorio ni plantilla de terceros</w:t>
+      </w:r>
+      <w:r>
+        <w:t xml:space="preserve">. Su punto de partida es una </w:t>
+      </w:r>
+      <w:r>
+        <w:rPr>
+          <w:b/>
+          <w:bCs/>
+        </w:rPr>
+        <w:t xml:space="preserve">versión inicial generada mediante IA</w:t>
+      </w:r>
+      <w:r>
+        <w:t xml:space="preserve">: un único archivo HTML (</w:t>
+      </w:r>
+      <w:r>
+        <w:rPr>
+          <w:rFonts w:ascii="Consolas" w:cs="Consolas" w:eastAsia="Consolas" w:hAnsi="Consolas"/>
+          <w:sz w:val="19"/>
+          <w:szCs w:val="19"/>
+        </w:rPr>
+        <w:t xml:space="preserve">docs/version_inicial/NOCTILUZ — Tienda.html</w:t>
+      </w:r>
+      <w:r>
+        <w:t xml:space="preserve">) con la portada, el catálogo, la ficha de producto y un carrito guardado en el navegador, sin servidor, sin persistencia y con el filtro de modo sin funcionar. </w:t>
+      </w:r>
+      <w:r>
         <w:rPr>
           <w:b/>
           <w:bCs/>
           <w:highlight w:val="yellow"/>
           <w:highlightCs w:val="yellow"/>
         </w:rPr>
-        <w:t xml:space="preserve">[COMPLETAR: herramienta usada para generar el HTML inicial]</w:t>
+        <w:t xml:space="preserve">[COMPLETAR: herramienta de IA con la que se generó y quién la generó]</w:t>
       </w:r>
       <w:r>
         <w:t xml:space="preserve">.</w:t>
+      </w:r>
+    </w:p>
+    <w:p>
+      <w:pPr>
+        <w:spacing w:after="120" w:line="276"/>
+        <w:jc w:val="both"/>
+      </w:pPr>
+      <w:r>
+        <w:t xml:space="preserve">A partir de esa versión se reutilizó el diseño visual y, con asistencia de Claude Code, se desarrolló el resto: servidor PHP, modelo de datos, checkout, pago simulado, pedidos y estados, soporte, back-office e instrumentación de eventos. El primer commit del repositorio contiene la versión inicial sin modificar, para que la evolución posterior sea trazable en el historial.</w:t>
+      </w:r>
+    </w:p>
+    <w:p>
+      <w:r>
+        <w:br w:type="page"/>
+      </w:r>
+    </w:p>
+    <w:p>
+      <w:pPr>
+        <w:pStyle w:val="Heading1"/>
+      </w:pPr>
+      <w:r>
+        <w:t xml:space="preserve">Anexo A. Uso de IA generativa</w:t>
+      </w:r>
+    </w:p>
+    <w:p>
+      <w:pPr>
+        <w:pStyle w:val="Heading2"/>
+      </w:pPr>
+      <w:r>
+        <w:t xml:space="preserve">a) Herramientas utilizadas</w:t>
       </w:r>
     </w:p>
     <w:p>
@@ -3900,7 +4013,29 @@
         <w:spacing w:after="60" w:line="264"/>
       </w:pPr>
       <w:r>
-        <w:t xml:space="preserve">Claude Code (Anthropic), asistente de programación, usado durante el desarrollo en septiembre de 2026.</w:t>
+        <w:rPr>
+          <w:b/>
+          <w:bCs/>
+          <w:highlight w:val="yellow"/>
+          <w:highlightCs w:val="yellow"/>
+        </w:rPr>
+        <w:t xml:space="preserve">[COMPLETAR: herramienta usada para generar el HTML inicial]</w:t>
+      </w:r>
+      <w:r>
+        <w:t xml:space="preserve">.</w:t>
+      </w:r>
+    </w:p>
+    <w:p>
+      <w:pPr>
+        <w:pStyle w:val="ListParagraph"/>
+        <w:numPr>
+          <w:ilvl w:val="0"/>
+          <w:numId w:val="2"/>
+        </w:numPr>
+        <w:spacing w:after="60" w:line="264"/>
+      </w:pPr>
+      <w:r>
+        <w:t xml:space="preserve">Claude Code (Anthropic), asistente de programación, usado durante el desarrollo y el despliegue (septiembre y octubre de 2026).</w:t>
       </w:r>
     </w:p>
     <w:p>
@@ -4619,24 +4754,18 @@
         <w:spacing w:after="60" w:line="264"/>
       </w:pPr>
       <w:r>
-        <w:rPr>
-          <w:b/>
-          <w:bCs/>
-          <w:highlight w:val="yellow"/>
-          <w:highlightCs w:val="yellow"/>
-        </w:rPr>
-        <w:t xml:space="preserve">[COMPLETAR: errores que el grupo haya detectado al revisar el código o al desplegar]</w:t>
-      </w:r>
-      <w:r>
-        <w:t xml:space="preserve">.</w:t>
-      </w:r>
-    </w:p>
-    <w:p>
-      <w:pPr>
-        <w:pStyle w:val="Heading2"/>
-      </w:pPr>
-      <w:r>
-        <w:t xml:space="preserve">e) Cambios realizados por el grupo</w:t>
+        <w:t xml:space="preserve">Al desplegar: el primer ZIP generado para subir los archivos guardaba las rutas con barra invertida (</w:t>
+      </w:r>
+      <w:r>
+        <w:rPr>
+          <w:rFonts w:ascii="Consolas" w:cs="Consolas" w:eastAsia="Consolas" w:hAnsi="Consolas"/>
+          <w:sz w:val="19"/>
+          <w:szCs w:val="19"/>
+        </w:rPr>
+        <w:t xml:space="preserve">app\Db.php</w:t>
+      </w:r>
+      <w:r>
+        <w:t xml:space="preserve">), y el servidor Linux solo extrajo los archivos de la raíz. Se rehízo con barras normales.</w:t>
       </w:r>
     </w:p>
     <w:p>
@@ -4649,24 +4778,29 @@
         <w:spacing w:after="60" w:line="264"/>
       </w:pPr>
       <w:r>
-        <w:rPr>
-          <w:b/>
-          <w:bCs/>
-          <w:highlight w:val="yellow"/>
-          <w:highlightCs w:val="yellow"/>
-        </w:rPr>
-        <w:t xml:space="preserve">[COMPLETAR: qué ha revisado, modificado o añadido cada integrante, en coherencia con el historial de commits]</w:t>
-      </w:r>
-      <w:r>
-        <w:t xml:space="preserve">.</w:t>
-      </w:r>
-    </w:p>
-    <w:p>
-      <w:pPr>
-        <w:pStyle w:val="Heading2"/>
-      </w:pPr>
-      <w:r>
-        <w:t xml:space="preserve">f) Validación del resultado final</w:t>
+        <w:t xml:space="preserve">Al desplegar: el PHP del hosting trae una configuración de precisión distinta de la local y la API devolvía importes como </w:t>
+      </w:r>
+      <w:r>
+        <w:rPr>
+          <w:rFonts w:ascii="Consolas" w:cs="Consolas" w:eastAsia="Consolas" w:hAnsi="Consolas"/>
+          <w:sz w:val="19"/>
+          <w:szCs w:val="19"/>
+        </w:rPr>
+        <w:t xml:space="preserve">14.9000000000000003552</w:t>
+      </w:r>
+      <w:r>
+        <w:t xml:space="preserve">. Se corrigió fijando </w:t>
+      </w:r>
+      <w:r>
+        <w:rPr>
+          <w:rFonts w:ascii="Consolas" w:cs="Consolas" w:eastAsia="Consolas" w:hAnsi="Consolas"/>
+          <w:sz w:val="19"/>
+          <w:szCs w:val="19"/>
+        </w:rPr>
+        <w:t xml:space="preserve">serialize_precision</w:t>
+      </w:r>
+      <w:r>
+        <w:t xml:space="preserve"> en el arranque de la API.</w:t>
       </w:r>
     </w:p>
     <w:p>
@@ -4679,7 +4813,7 @@
         <w:spacing w:after="60" w:line="264"/>
       </w:pPr>
       <w:r>
-        <w:t xml:space="preserve">Pruebas manuales del flujo completo en local: filtros combinados, ficha, carrito, checkout, cupones, envío exprés, pago rechazado y aprobado, seguimiento, soporte y back-office.</w:t>
+        <w:t xml:space="preserve">La IA propuso inicialmente Vercel como opción provisional; se descartó al comprobar que no ejecuta PHP de forma nativa ni ofrece MySQL.</w:t>
       </w:r>
     </w:p>
     <w:p>
@@ -4692,7 +4826,24 @@
         <w:spacing w:after="60" w:line="264"/>
       </w:pPr>
       <w:r>
-        <w:t xml:space="preserve">Comprobación a mano de los importes: por ejemplo, 247,00 € con NOCHE10 da un descuento de 24,70 €, envío gratuito, total de 222,30 €, base imponible de 183,72 € e IVA de 38,58 €.</w:t>
+        <w:rPr>
+          <w:b/>
+          <w:bCs/>
+          <w:highlight w:val="yellow"/>
+          <w:highlightCs w:val="yellow"/>
+        </w:rPr>
+        <w:t xml:space="preserve">[COMPLETAR: errores que el grupo haya detectado al revisar el código]</w:t>
+      </w:r>
+      <w:r>
+        <w:t xml:space="preserve">.</w:t>
+      </w:r>
+    </w:p>
+    <w:p>
+      <w:pPr>
+        <w:pStyle w:val="Heading2"/>
+      </w:pPr>
+      <w:r>
+        <w:t xml:space="preserve">e) Cambios realizados por el grupo</w:t>
       </w:r>
     </w:p>
     <w:p>
@@ -4705,7 +4856,7 @@
         <w:spacing w:after="60" w:line="264"/>
       </w:pPr>
       <w:r>
-        <w:t xml:space="preserve">Peticiones directas a la API saltándose la interfaz: datos inválidos, modos no admitidos, productos agotados, precios manipulados (se ignoran), transiciones de estado prohibidas y acceso al back-office sin sesión.</w:t>
+        <w:t xml:space="preserve">Luis Galindo: despliegue en el hosting (cuenta, base de datos MySQL, importación del esquema y los datos, subida de archivos) y pruebas de compra y back-office en la URL pública.</w:t>
       </w:r>
     </w:p>
     <w:p>
@@ -4718,7 +4869,24 @@
         <w:spacing w:after="60" w:line="264"/>
       </w:pPr>
       <w:r>
-        <w:t xml:space="preserve">Comprobación de que cancelar un pedido devuelve el stock y de que la vista en móvil no se desborda horizontalmente.</w:t>
+        <w:rPr>
+          <w:b/>
+          <w:bCs/>
+          <w:highlight w:val="yellow"/>
+          <w:highlightCs w:val="yellow"/>
+        </w:rPr>
+        <w:t xml:space="preserve">[COMPLETAR: qué ha revisado, modificado o añadido cada integrante, en coherencia con el historial de commits]</w:t>
+      </w:r>
+      <w:r>
+        <w:t xml:space="preserve">.</w:t>
+      </w:r>
+    </w:p>
+    <w:p>
+      <w:pPr>
+        <w:pStyle w:val="Heading2"/>
+      </w:pPr>
+      <w:r>
+        <w:t xml:space="preserve">f) Validación del resultado final</w:t>
       </w:r>
     </w:p>
     <w:p>
@@ -4731,16 +4899,92 @@
         <w:spacing w:after="60" w:line="264"/>
       </w:pPr>
       <w:r>
-        <w:rPr>
-          <w:b/>
-          <w:bCs/>
-          <w:highlight w:val="yellow"/>
-          <w:highlightCs w:val="yellow"/>
-        </w:rPr>
-        <w:t xml:space="preserve">[COMPLETAR: pruebas realizadas por el grupo en el hosting de DonDominio y su resultado]</w:t>
-      </w:r>
-      <w:r>
-        <w:t xml:space="preserve">.</w:t>
+        <w:t xml:space="preserve">Pruebas manuales del flujo completo en local: filtros combinados, ficha, carrito, checkout, cupones, envío exprés, pago rechazado y aprobado, seguimiento, soporte y back-office.</w:t>
+      </w:r>
+    </w:p>
+    <w:p>
+      <w:pPr>
+        <w:pStyle w:val="ListParagraph"/>
+        <w:numPr>
+          <w:ilvl w:val="0"/>
+          <w:numId w:val="2"/>
+        </w:numPr>
+        <w:spacing w:after="60" w:line="264"/>
+      </w:pPr>
+      <w:r>
+        <w:t xml:space="preserve">Comprobación a mano de los importes: por ejemplo, 247,00 € con NOCHE10 da un descuento de 24,70 €, envío gratuito, total de 222,30 €, base imponible de 183,72 € e IVA de 38,58 €.</w:t>
+      </w:r>
+    </w:p>
+    <w:p>
+      <w:pPr>
+        <w:pStyle w:val="ListParagraph"/>
+        <w:numPr>
+          <w:ilvl w:val="0"/>
+          <w:numId w:val="2"/>
+        </w:numPr>
+        <w:spacing w:after="60" w:line="264"/>
+      </w:pPr>
+      <w:r>
+        <w:t xml:space="preserve">Peticiones directas a la API saltándose la interfaz: datos inválidos, modos no admitidos, productos agotados, precios manipulados (se ignoran), transiciones de estado prohibidas y acceso al back-office sin sesión.</w:t>
+      </w:r>
+    </w:p>
+    <w:p>
+      <w:pPr>
+        <w:pStyle w:val="ListParagraph"/>
+        <w:numPr>
+          <w:ilvl w:val="0"/>
+          <w:numId w:val="2"/>
+        </w:numPr>
+        <w:spacing w:after="60" w:line="264"/>
+      </w:pPr>
+      <w:r>
+        <w:t xml:space="preserve">Comprobación de que cancelar un pedido devuelve el stock y de que la vista en móvil no se desborda horizontalmente.</w:t>
+      </w:r>
+    </w:p>
+    <w:p>
+      <w:pPr>
+        <w:pStyle w:val="ListParagraph"/>
+        <w:numPr>
+          <w:ilvl w:val="0"/>
+          <w:numId w:val="2"/>
+        </w:numPr>
+        <w:spacing w:after="60" w:line="264"/>
+      </w:pPr>
+      <w:r>
+        <w:t xml:space="preserve">En el hosting (https://algo.free.je): el catálogo carga los 16 productos desde MySQL; </w:t>
+      </w:r>
+      <w:r>
+        <w:rPr>
+          <w:rFonts w:ascii="Consolas" w:cs="Consolas" w:eastAsia="Consolas" w:hAnsi="Consolas"/>
+          <w:sz w:val="19"/>
+          <w:szCs w:val="19"/>
+        </w:rPr>
+        <w:t xml:space="preserve">app/config.php</w:t>
+      </w:r>
+      <w:r>
+        <w:t xml:space="preserve">, </w:t>
+      </w:r>
+      <w:r>
+        <w:rPr>
+          <w:rFonts w:ascii="Consolas" w:cs="Consolas" w:eastAsia="Consolas" w:hAnsi="Consolas"/>
+          <w:sz w:val="19"/>
+          <w:szCs w:val="19"/>
+        </w:rPr>
+        <w:t xml:space="preserve">app/Db.php</w:t>
+      </w:r>
+      <w:r>
+        <w:t xml:space="preserve"> y </w:t>
+      </w:r>
+      <w:r>
+        <w:rPr>
+          <w:rFonts w:ascii="Consolas" w:cs="Consolas" w:eastAsia="Consolas" w:hAnsi="Consolas"/>
+          <w:sz w:val="19"/>
+          <w:szCs w:val="19"/>
+        </w:rPr>
+        <w:t xml:space="preserve">datos/</w:t>
+      </w:r>
+      <w:r>
+        <w:t xml:space="preserve"> responden 403; la API del back-office responde 401 sin sesión; el cálculo de 149 € con NOCHE10 da 134,10 € (base 110,83 € e IVA 23,27 €); y se completaron una compra con pago aprobado y su revisión en el back-office, con el pedido y sus eventos.</w:t>
       </w:r>
     </w:p>
     <w:sectPr>

</xml_diff>

<commit_message>
Añade el diagrama entidad-relación al modelo de datos de la memoria
El punto 2 solo tenía el esquema de tablas. Ahora incluye un diagrama
E-R en notación de Chen (Figura 1) y deja el esquema relacional como
Figura 2.

Co-Authored-By: Claude Opus 5.5 <noreply@anthropic.com>
</commit_message>
<xml_diff>
--- a/docs/Memoria_NOCTILUZ.docx
+++ b/docs/Memoria_NOCTILUZ.docx
@@ -1662,12 +1662,263 @@
     </w:p>
     <w:p>
       <w:pPr>
+        <w:spacing w:after="120" w:line="276"/>
+        <w:jc w:val="both"/>
+      </w:pPr>
+      <w:r>
+        <w:t xml:space="preserve">El modelo conceptual se representa con un diagrama entidad-relación en notación de Chen (Figura 1): los rectángulos son entidades, los rombos son relaciones y en cada extremo se indica la cardinalidad. La única relación N:M es la de </w:t>
+      </w:r>
+      <w:r>
+        <w:rPr>
+          <w:rFonts w:ascii="Consolas" w:cs="Consolas" w:eastAsia="Consolas" w:hAnsi="Consolas"/>
+          <w:sz w:val="19"/>
+          <w:szCs w:val="19"/>
+        </w:rPr>
+        <w:t xml:space="preserve">PRODUCTO</w:t>
+      </w:r>
+      <w:r>
+        <w:t xml:space="preserve"> y </w:t>
+      </w:r>
+      <w:r>
+        <w:rPr>
+          <w:rFonts w:ascii="Consolas" w:cs="Consolas" w:eastAsia="Consolas" w:hAnsi="Consolas"/>
+          <w:sz w:val="19"/>
+          <w:szCs w:val="19"/>
+        </w:rPr>
+        <w:t xml:space="preserve">MODO</w:t>
+      </w:r>
+      <w:r>
+        <w:t xml:space="preserve"> (qué modos de iluminación admite cada modelo), que en el esquema relacional se convierte en la tabla intermedia </w:t>
+      </w:r>
+      <w:r>
+        <w:rPr>
+          <w:rFonts w:ascii="Consolas" w:cs="Consolas" w:eastAsia="Consolas" w:hAnsi="Consolas"/>
+          <w:sz w:val="19"/>
+          <w:szCs w:val="19"/>
+        </w:rPr>
+        <w:t xml:space="preserve">producto_modos</w:t>
+      </w:r>
+      <w:r>
+        <w:t xml:space="preserve">. La compra de una variante con un modo y una talla concretos se modela como la entidad </w:t>
+      </w:r>
+      <w:r>
+        <w:rPr>
+          <w:rFonts w:ascii="Consolas" w:cs="Consolas" w:eastAsia="Consolas" w:hAnsi="Consolas"/>
+          <w:sz w:val="19"/>
+          <w:szCs w:val="19"/>
+        </w:rPr>
+        <w:t xml:space="preserve">LÍNEA DE PEDIDO</w:t>
+      </w:r>
+      <w:r>
+        <w:t xml:space="preserve">, que guarda además la cantidad y el precio del momento.</w:t>
+      </w:r>
+    </w:p>
+    <w:p>
+      <w:pPr>
+        <w:spacing w:after="120" w:line="276"/>
+        <w:jc w:val="both"/>
+      </w:pPr>
+      <w:r>
+        <w:rPr>
+          <w:b/>
+          <w:bCs/>
+        </w:rPr>
+        <w:t xml:space="preserve">Datos maestros.</w:t>
+      </w:r>
+      <w:r>
+        <w:t xml:space="preserve"> </w:t>
+      </w:r>
+      <w:r>
+        <w:rPr>
+          <w:rFonts w:ascii="Consolas" w:cs="Consolas" w:eastAsia="Consolas" w:hAnsi="Consolas"/>
+          <w:sz w:val="19"/>
+          <w:szCs w:val="19"/>
+        </w:rPr>
+        <w:t xml:space="preserve">categorias</w:t>
+      </w:r>
+      <w:r>
+        <w:t xml:space="preserve">, </w:t>
+      </w:r>
+      <w:r>
+        <w:rPr>
+          <w:rFonts w:ascii="Consolas" w:cs="Consolas" w:eastAsia="Consolas" w:hAnsi="Consolas"/>
+          <w:sz w:val="19"/>
+          <w:szCs w:val="19"/>
+        </w:rPr>
+        <w:t xml:space="preserve">colores</w:t>
+      </w:r>
+      <w:r>
+        <w:t xml:space="preserve"> y </w:t>
+      </w:r>
+      <w:r>
+        <w:rPr>
+          <w:rFonts w:ascii="Consolas" w:cs="Consolas" w:eastAsia="Consolas" w:hAnsi="Consolas"/>
+          <w:sz w:val="19"/>
+          <w:szCs w:val="19"/>
+        </w:rPr>
+        <w:t xml:space="preserve">modos</w:t>
+      </w:r>
+      <w:r>
+        <w:t xml:space="preserve"> son los tres criterios del catálogo. </w:t>
+      </w:r>
+      <w:r>
+        <w:rPr>
+          <w:rFonts w:ascii="Consolas" w:cs="Consolas" w:eastAsia="Consolas" w:hAnsi="Consolas"/>
+          <w:sz w:val="19"/>
+          <w:szCs w:val="19"/>
+        </w:rPr>
+        <w:t xml:space="preserve">productos</w:t>
+      </w:r>
+      <w:r>
+        <w:t xml:space="preserve"> guarda la información común de cada modelo (precio, material, autonomía, si tiene tallas) y </w:t>
+      </w:r>
+      <w:r>
+        <w:rPr>
+          <w:rFonts w:ascii="Consolas" w:cs="Consolas" w:eastAsia="Consolas" w:hAnsi="Consolas"/>
+          <w:sz w:val="19"/>
+          <w:szCs w:val="19"/>
+        </w:rPr>
+        <w:t xml:space="preserve">producto_modos</w:t>
+      </w:r>
+      <w:r>
+        <w:t xml:space="preserve"> resuelve la relación N:M entre productos y modos admitidos. </w:t>
+      </w:r>
+      <w:r>
+        <w:rPr>
+          <w:rFonts w:ascii="Consolas" w:cs="Consolas" w:eastAsia="Consolas" w:hAnsi="Consolas"/>
+          <w:sz w:val="19"/>
+          <w:szCs w:val="19"/>
+        </w:rPr>
+        <w:t xml:space="preserve">variantes</w:t>
+      </w:r>
+      <w:r>
+        <w:t xml:space="preserve"> representa cada SKU (producto + color) con su stock e imagen. </w:t>
+      </w:r>
+      <w:r>
+        <w:rPr>
+          <w:rFonts w:ascii="Consolas" w:cs="Consolas" w:eastAsia="Consolas" w:hAnsi="Consolas"/>
+          <w:sz w:val="19"/>
+          <w:szCs w:val="19"/>
+        </w:rPr>
+        <w:t xml:space="preserve">cupones</w:t>
+      </w:r>
+      <w:r>
+        <w:t xml:space="preserve"> y </w:t>
+      </w:r>
+      <w:r>
+        <w:rPr>
+          <w:rFonts w:ascii="Consolas" w:cs="Consolas" w:eastAsia="Consolas" w:hAnsi="Consolas"/>
+          <w:sz w:val="19"/>
+          <w:szCs w:val="19"/>
+        </w:rPr>
+        <w:t xml:space="preserve">usuarios_admin</w:t>
+      </w:r>
+      <w:r>
+        <w:t xml:space="preserve"> completan los datos de referencia.</w:t>
+      </w:r>
+    </w:p>
+    <w:p>
+      <w:pPr>
+        <w:spacing w:after="120" w:line="276"/>
+        <w:jc w:val="both"/>
+      </w:pPr>
+      <w:r>
+        <w:rPr>
+          <w:b/>
+          <w:bCs/>
+        </w:rPr>
+        <w:t xml:space="preserve">Datos transaccionales.</w:t>
+      </w:r>
+      <w:r>
+        <w:t xml:space="preserve"> </w:t>
+      </w:r>
+      <w:r>
+        <w:rPr>
+          <w:rFonts w:ascii="Consolas" w:cs="Consolas" w:eastAsia="Consolas" w:hAnsi="Consolas"/>
+          <w:sz w:val="19"/>
+          <w:szCs w:val="19"/>
+        </w:rPr>
+        <w:t xml:space="preserve">clientes</w:t>
+      </w:r>
+      <w:r>
+        <w:t xml:space="preserve"> se identifica por un email único. </w:t>
+      </w:r>
+      <w:r>
+        <w:rPr>
+          <w:rFonts w:ascii="Consolas" w:cs="Consolas" w:eastAsia="Consolas" w:hAnsi="Consolas"/>
+          <w:sz w:val="19"/>
+          <w:szCs w:val="19"/>
+        </w:rPr>
+        <w:t xml:space="preserve">pedidos</w:t>
+      </w:r>
+      <w:r>
+        <w:t xml:space="preserve"> guarda el código único (</w:t>
+      </w:r>
+      <w:r>
+        <w:rPr>
+          <w:rFonts w:ascii="Consolas" w:cs="Consolas" w:eastAsia="Consolas" w:hAnsi="Consolas"/>
+          <w:sz w:val="19"/>
+          <w:szCs w:val="19"/>
+        </w:rPr>
+        <w:t xml:space="preserve">NCZ-AAMMDD-XXXXXX</w:t>
+      </w:r>
+      <w:r>
+        <w:t xml:space="preserve">), el estado, el desglose completo de importes (subtotal, descuento, envío, base imponible, IVA y total) y una copia de la dirección. </w:t>
+      </w:r>
+      <w:r>
+        <w:rPr>
+          <w:rFonts w:ascii="Consolas" w:cs="Consolas" w:eastAsia="Consolas" w:hAnsi="Consolas"/>
+          <w:sz w:val="19"/>
+          <w:szCs w:val="19"/>
+        </w:rPr>
+        <w:t xml:space="preserve">lineas_pedido</w:t>
+      </w:r>
+      <w:r>
+        <w:t xml:space="preserve"> conserva la descripción y el precio del momento de la compra para que un cambio de precio posterior no altere pedidos pasados. </w:t>
+      </w:r>
+      <w:r>
+        <w:rPr>
+          <w:rFonts w:ascii="Consolas" w:cs="Consolas" w:eastAsia="Consolas" w:hAnsi="Consolas"/>
+          <w:sz w:val="19"/>
+          <w:szCs w:val="19"/>
+        </w:rPr>
+        <w:t xml:space="preserve">pagos</w:t>
+      </w:r>
+      <w:r>
+        <w:t xml:space="preserve"> registra cada intento, aprobado o rechazado; </w:t>
+      </w:r>
+      <w:r>
+        <w:rPr>
+          <w:rFonts w:ascii="Consolas" w:cs="Consolas" w:eastAsia="Consolas" w:hAnsi="Consolas"/>
+          <w:sz w:val="19"/>
+          <w:szCs w:val="19"/>
+        </w:rPr>
+        <w:t xml:space="preserve">historial_estados</w:t>
+      </w:r>
+      <w:r>
+        <w:t xml:space="preserve"> deja trazabilidad de cada transición (quién, cuándo y por qué); </w:t>
+      </w:r>
+      <w:r>
+        <w:rPr>
+          <w:rFonts w:ascii="Consolas" w:cs="Consolas" w:eastAsia="Consolas" w:hAnsi="Consolas"/>
+          <w:sz w:val="19"/>
+          <w:szCs w:val="19"/>
+        </w:rPr>
+        <w:t xml:space="preserve">incidencias</w:t>
+      </w:r>
+      <w:r>
+        <w:t xml:space="preserve"> recoge el soporte postventa.</w:t>
+      </w:r>
+    </w:p>
+    <w:p>
+      <w:pPr>
+        <w:keepNext/>
         <w:jc w:val="center"/>
       </w:pPr>
       <w:r>
         <w:drawing>
           <wp:inline distT="0" distB="0" distL="0" distR="0">
-            <wp:extent cx="5762625" cy="3371850"/>
+            <wp:extent cx="5334000" cy="6057900"/>
             <wp:effectExtent t="0" r="0" b="0" l="0"/>
             <wp:docPr id="1" name="" descr="" title=""/>
             <wp:cNvGraphicFramePr>
@@ -1692,7 +1943,7 @@
                   <pic:spPr bwMode="auto">
                     <a:xfrm>
                       <a:off x="0" y="0"/>
-                      <a:ext cx="5762625" cy="3371850"/>
+                      <a:ext cx="5334000" cy="6057900"/>
                     </a:xfrm>
                     <a:prstGeom prst="rect">
                       <a:avLst/>
@@ -1718,204 +1969,7 @@
           <w:sz w:val="18"/>
           <w:szCs w:val="18"/>
         </w:rPr>
-        <w:t xml:space="preserve">Figura 1. Esquema de entidades (15 tablas). Generado a partir de database/esquema_mysql.sql.</w:t>
-      </w:r>
-    </w:p>
-    <w:p>
-      <w:pPr>
-        <w:spacing w:after="120" w:line="276"/>
-        <w:jc w:val="both"/>
-      </w:pPr>
-      <w:r>
-        <w:rPr>
-          <w:b/>
-          <w:bCs/>
-        </w:rPr>
-        <w:t xml:space="preserve">Datos maestros.</w:t>
-      </w:r>
-      <w:r>
-        <w:t xml:space="preserve"> </w:t>
-      </w:r>
-      <w:r>
-        <w:rPr>
-          <w:rFonts w:ascii="Consolas" w:cs="Consolas" w:eastAsia="Consolas" w:hAnsi="Consolas"/>
-          <w:sz w:val="19"/>
-          <w:szCs w:val="19"/>
-        </w:rPr>
-        <w:t xml:space="preserve">categorias</w:t>
-      </w:r>
-      <w:r>
-        <w:t xml:space="preserve">, </w:t>
-      </w:r>
-      <w:r>
-        <w:rPr>
-          <w:rFonts w:ascii="Consolas" w:cs="Consolas" w:eastAsia="Consolas" w:hAnsi="Consolas"/>
-          <w:sz w:val="19"/>
-          <w:szCs w:val="19"/>
-        </w:rPr>
-        <w:t xml:space="preserve">colores</w:t>
-      </w:r>
-      <w:r>
-        <w:t xml:space="preserve"> y </w:t>
-      </w:r>
-      <w:r>
-        <w:rPr>
-          <w:rFonts w:ascii="Consolas" w:cs="Consolas" w:eastAsia="Consolas" w:hAnsi="Consolas"/>
-          <w:sz w:val="19"/>
-          <w:szCs w:val="19"/>
-        </w:rPr>
-        <w:t xml:space="preserve">modos</w:t>
-      </w:r>
-      <w:r>
-        <w:t xml:space="preserve"> son los tres criterios del catálogo. </w:t>
-      </w:r>
-      <w:r>
-        <w:rPr>
-          <w:rFonts w:ascii="Consolas" w:cs="Consolas" w:eastAsia="Consolas" w:hAnsi="Consolas"/>
-          <w:sz w:val="19"/>
-          <w:szCs w:val="19"/>
-        </w:rPr>
-        <w:t xml:space="preserve">productos</w:t>
-      </w:r>
-      <w:r>
-        <w:t xml:space="preserve"> guarda la información común de cada modelo (precio, material, autonomía, si tiene tallas) y </w:t>
-      </w:r>
-      <w:r>
-        <w:rPr>
-          <w:rFonts w:ascii="Consolas" w:cs="Consolas" w:eastAsia="Consolas" w:hAnsi="Consolas"/>
-          <w:sz w:val="19"/>
-          <w:szCs w:val="19"/>
-        </w:rPr>
-        <w:t xml:space="preserve">producto_modos</w:t>
-      </w:r>
-      <w:r>
-        <w:t xml:space="preserve"> resuelve la relación N:M entre productos y modos admitidos. </w:t>
-      </w:r>
-      <w:r>
-        <w:rPr>
-          <w:rFonts w:ascii="Consolas" w:cs="Consolas" w:eastAsia="Consolas" w:hAnsi="Consolas"/>
-          <w:sz w:val="19"/>
-          <w:szCs w:val="19"/>
-        </w:rPr>
-        <w:t xml:space="preserve">variantes</w:t>
-      </w:r>
-      <w:r>
-        <w:t xml:space="preserve"> representa cada SKU (producto + color) con su stock e imagen. </w:t>
-      </w:r>
-      <w:r>
-        <w:rPr>
-          <w:rFonts w:ascii="Consolas" w:cs="Consolas" w:eastAsia="Consolas" w:hAnsi="Consolas"/>
-          <w:sz w:val="19"/>
-          <w:szCs w:val="19"/>
-        </w:rPr>
-        <w:t xml:space="preserve">cupones</w:t>
-      </w:r>
-      <w:r>
-        <w:t xml:space="preserve"> y </w:t>
-      </w:r>
-      <w:r>
-        <w:rPr>
-          <w:rFonts w:ascii="Consolas" w:cs="Consolas" w:eastAsia="Consolas" w:hAnsi="Consolas"/>
-          <w:sz w:val="19"/>
-          <w:szCs w:val="19"/>
-        </w:rPr>
-        <w:t xml:space="preserve">usuarios_admin</w:t>
-      </w:r>
-      <w:r>
-        <w:t xml:space="preserve"> completan los datos de referencia.</w:t>
-      </w:r>
-    </w:p>
-    <w:p>
-      <w:pPr>
-        <w:spacing w:after="120" w:line="276"/>
-        <w:jc w:val="both"/>
-      </w:pPr>
-      <w:r>
-        <w:rPr>
-          <w:b/>
-          <w:bCs/>
-        </w:rPr>
-        <w:t xml:space="preserve">Datos transaccionales.</w:t>
-      </w:r>
-      <w:r>
-        <w:t xml:space="preserve"> </w:t>
-      </w:r>
-      <w:r>
-        <w:rPr>
-          <w:rFonts w:ascii="Consolas" w:cs="Consolas" w:eastAsia="Consolas" w:hAnsi="Consolas"/>
-          <w:sz w:val="19"/>
-          <w:szCs w:val="19"/>
-        </w:rPr>
-        <w:t xml:space="preserve">clientes</w:t>
-      </w:r>
-      <w:r>
-        <w:t xml:space="preserve"> se identifica por un email único. </w:t>
-      </w:r>
-      <w:r>
-        <w:rPr>
-          <w:rFonts w:ascii="Consolas" w:cs="Consolas" w:eastAsia="Consolas" w:hAnsi="Consolas"/>
-          <w:sz w:val="19"/>
-          <w:szCs w:val="19"/>
-        </w:rPr>
-        <w:t xml:space="preserve">pedidos</w:t>
-      </w:r>
-      <w:r>
-        <w:t xml:space="preserve"> guarda el código único (</w:t>
-      </w:r>
-      <w:r>
-        <w:rPr>
-          <w:rFonts w:ascii="Consolas" w:cs="Consolas" w:eastAsia="Consolas" w:hAnsi="Consolas"/>
-          <w:sz w:val="19"/>
-          <w:szCs w:val="19"/>
-        </w:rPr>
-        <w:t xml:space="preserve">NCZ-AAMMDD-XXXXXX</w:t>
-      </w:r>
-      <w:r>
-        <w:t xml:space="preserve">), el estado, el desglose completo de importes (subtotal, descuento, envío, base imponible, IVA y total) y una copia de la dirección. </w:t>
-      </w:r>
-      <w:r>
-        <w:rPr>
-          <w:rFonts w:ascii="Consolas" w:cs="Consolas" w:eastAsia="Consolas" w:hAnsi="Consolas"/>
-          <w:sz w:val="19"/>
-          <w:szCs w:val="19"/>
-        </w:rPr>
-        <w:t xml:space="preserve">lineas_pedido</w:t>
-      </w:r>
-      <w:r>
-        <w:t xml:space="preserve"> conserva la descripción y el precio del momento de la compra para que un cambio de precio posterior no altere pedidos pasados. </w:t>
-      </w:r>
-      <w:r>
-        <w:rPr>
-          <w:rFonts w:ascii="Consolas" w:cs="Consolas" w:eastAsia="Consolas" w:hAnsi="Consolas"/>
-          <w:sz w:val="19"/>
-          <w:szCs w:val="19"/>
-        </w:rPr>
-        <w:t xml:space="preserve">pagos</w:t>
-      </w:r>
-      <w:r>
-        <w:t xml:space="preserve"> registra cada intento, aprobado o rechazado; </w:t>
-      </w:r>
-      <w:r>
-        <w:rPr>
-          <w:rFonts w:ascii="Consolas" w:cs="Consolas" w:eastAsia="Consolas" w:hAnsi="Consolas"/>
-          <w:sz w:val="19"/>
-          <w:szCs w:val="19"/>
-        </w:rPr>
-        <w:t xml:space="preserve">historial_estados</w:t>
-      </w:r>
-      <w:r>
-        <w:t xml:space="preserve"> deja trazabilidad de cada transición (quién, cuándo y por qué); </w:t>
-      </w:r>
-      <w:r>
-        <w:rPr>
-          <w:rFonts w:ascii="Consolas" w:cs="Consolas" w:eastAsia="Consolas" w:hAnsi="Consolas"/>
-          <w:sz w:val="19"/>
-          <w:szCs w:val="19"/>
-        </w:rPr>
-        <w:t xml:space="preserve">incidencias</w:t>
-      </w:r>
-      <w:r>
-        <w:t xml:space="preserve"> recoge el soporte postventa.</w:t>
+        <w:t xml:space="preserve">Figura 1. Diagrama entidad-relación (notación de Chen).</w:t>
       </w:r>
     </w:p>
     <w:p>
@@ -2522,6 +2576,78 @@
       <w:pPr>
         <w:spacing w:after="80"/>
       </w:pPr>
+    </w:p>
+    <w:p>
+      <w:pPr>
+        <w:keepNext/>
+        <w:spacing w:after="120" w:line="276"/>
+        <w:jc w:val="both"/>
+      </w:pPr>
+      <w:r>
+        <w:t xml:space="preserve">La Figura 2 muestra el esquema relacional resultante, con las 15 tablas y sus claves primarias y foráneas.</w:t>
+      </w:r>
+    </w:p>
+    <w:p>
+      <w:pPr>
+        <w:keepNext/>
+        <w:jc w:val="center"/>
+      </w:pPr>
+      <w:r>
+        <w:drawing>
+          <wp:inline distT="0" distB="0" distL="0" distR="0">
+            <wp:extent cx="5762625" cy="3371850"/>
+            <wp:effectExtent t="0" r="0" b="0" l="0"/>
+            <wp:docPr id="1" name="" descr="" title=""/>
+            <wp:cNvGraphicFramePr>
+              <a:graphicFrameLocks xmlns:a="http://schemas.openxmlformats.org/drawingml/2006/main" noChangeAspect="1"/>
+            </wp:cNvGraphicFramePr>
+            <a:graphic xmlns:a="http://schemas.openxmlformats.org/drawingml/2006/main">
+              <a:graphicData uri="http://schemas.openxmlformats.org/drawingml/2006/picture">
+                <pic:pic xmlns:pic="http://schemas.openxmlformats.org/drawingml/2006/picture">
+                  <pic:nvPicPr>
+                    <pic:cNvPr id="0" name="" descr=""/>
+                    <pic:cNvPicPr>
+                      <a:picLocks noChangeAspect="1" noChangeArrowheads="1"/>
+                    </pic:cNvPicPr>
+                  </pic:nvPicPr>
+                  <pic:blipFill>
+                    <a:blip r:embed="rId10" cstate="none"/>
+                    <a:srcRect/>
+                    <a:stretch>
+                      <a:fillRect/>
+                    </a:stretch>
+                  </pic:blipFill>
+                  <pic:spPr bwMode="auto">
+                    <a:xfrm>
+                      <a:off x="0" y="0"/>
+                      <a:ext cx="5762625" cy="3371850"/>
+                    </a:xfrm>
+                    <a:prstGeom prst="rect">
+                      <a:avLst/>
+                    </a:prstGeom>
+                  </pic:spPr>
+                </pic:pic>
+              </a:graphicData>
+            </a:graphic>
+          </wp:inline>
+        </w:drawing>
+      </w:r>
+    </w:p>
+    <w:p>
+      <w:pPr>
+        <w:spacing w:after="200"/>
+        <w:jc w:val="center"/>
+      </w:pPr>
+      <w:r>
+        <w:rPr>
+          <w:i/>
+          <w:iCs/>
+          <w:color w:val="555555"/>
+          <w:sz w:val="18"/>
+          <w:szCs w:val="18"/>
+        </w:rPr>
+        <w:t xml:space="preserve">Figura 2. Esquema relacional (15 tablas). Generado a partir de database/esquema_mysql.sql.</w:t>
+      </w:r>
     </w:p>
     <w:p>
       <w:pPr>
@@ -4660,7 +4786,7 @@
                 <w:sz w:val="18"/>
                 <w:szCs w:val="18"/>
               </w:rPr>
-              <w:t xml:space="preserve">, borrador de esta memoria, diagrama de la Figura 1</w:t>
+              <w:t xml:space="preserve">, borrador de esta memoria, diagramas de las Figuras 1 y 2</w:t>
             </w:r>
           </w:p>
         </w:tc>

</xml_diff>

<commit_message>
Cambia la URL pública a noctiluz.free.je y ajusta la defensa al catálogo nuevo
- README, CLAUDE.md, COLABORAR.md, guion, diapositivas y memoria apuntan a https://noctiluz.free.je.
- Demo de la diapositiva 3 y del guion: "chaquetas + violeta + modo fijo" (con un solo modo por
  producto, el filtro con "degradado" ya no devolvía nada); el guion indica abrir el panel «Filtros».
- Memoria: la tabla de estados recoge que desde "pagado" y "en_preparacion" se puede pasar a
  enviado o entregado.

Co-Authored-By: Claude Opus 5.5 <noreply@anthropic.com>
</commit_message>
<xml_diff>
--- a/docs/Memoria_NOCTILUZ.docx
+++ b/docs/Memoria_NOCTILUZ.docx
@@ -146,7 +146,7 @@
         <w:jc w:val="center"/>
       </w:pPr>
       <w:r>
-        <w:t xml:space="preserve">URL pública: https://algo.free.je (despliegue provisional)</w:t>
+        <w:t xml:space="preserve">URL pública: https://noctiluz.free.je (despliegue provisional)</w:t>
       </w:r>
     </w:p>
     <w:p>
@@ -2247,7 +2247,7 @@
                 <w:sz w:val="18"/>
                 <w:szCs w:val="18"/>
               </w:rPr>
-              <w:t xml:space="preserve">en_preparacion, incidencia, cancelado</w:t>
+              <w:t xml:space="preserve">en_preparacion, enviado, entregado, incidencia, cancelado</w:t>
             </w:r>
           </w:p>
         </w:tc>
@@ -2310,7 +2310,7 @@
                 <w:sz w:val="18"/>
                 <w:szCs w:val="18"/>
               </w:rPr>
-              <w:t xml:space="preserve">enviado, incidencia, cancelado</w:t>
+              <w:t xml:space="preserve">enviado, entregado, incidencia, cancelado</w:t>
             </w:r>
           </w:p>
         </w:tc>
@@ -5077,7 +5077,7 @@
         <w:spacing w:after="60" w:line="264"/>
       </w:pPr>
       <w:r>
-        <w:t xml:space="preserve">En el hosting (https://algo.free.je): el catálogo carga los 16 productos desde MySQL; </w:t>
+        <w:t xml:space="preserve">En el hosting (https://noctiluz.free.je): el catálogo carga los 16 productos desde MySQL; </w:t>
       </w:r>
       <w:r>
         <w:rPr>

</xml_diff>